<commit_message>
Adopt house style v5.1 and bundle diagram-maker for figures
Co-Authored-By: Claude Opus 5.5 (1M context) <noreply@anthropic.com>
Claude-Session: https://claude.ai/code/session_01UiHLU5PSfYtvbU9aNiYacs
</commit_message>
<xml_diff>
--- a/assets/word-template/house-style-short.docx
+++ b/assets/word-template/house-style-short.docx
@@ -67,7 +67,7 @@
       <w:r>
         <w:drawing>
           <wp:inline distT="0" distB="0" distL="0" distR="0">
-            <wp:extent cx="5715000" cy="1114425"/>
+            <wp:extent cx="5486400" cy="1069848"/>
             <wp:docPr id="1" name="Figure 1"/>
             <wp:cNvGraphicFramePr>
               <a:graphicFrameLocks noChangeAspect="1"/>
@@ -88,7 +88,7 @@
                   <pic:spPr>
                     <a:xfrm>
                       <a:off x="0" y="0"/>
-                      <a:ext cx="5715000" cy="1114425"/>
+                      <a:ext cx="5486400" cy="1069848"/>
                     </a:xfrm>
                     <a:prstGeom prst="rect">
                       <a:avLst/>
@@ -150,14 +150,14 @@
         <w:tblLook w:val="0420" w:firstRow="0" w:lastRow="0" w:firstColumn="0" w:lastColumn="0" w:noHBand="1" w:noVBand="1"/>
       </w:tblPr>
       <w:tblGrid>
-        <w:gridCol w:w="3120"/>
-        <w:gridCol w:w="3120"/>
-        <w:gridCol w:w="3120"/>
+        <w:gridCol w:w="2880"/>
+        <w:gridCol w:w="2880"/>
+        <w:gridCol w:w="2880"/>
       </w:tblGrid>
       <w:tr>
         <w:tc>
           <w:tcPr>
-            <w:tcW w:w="3120" w:type="dxa"/>
+            <w:tcW w:w="2880" w:type="dxa"/>
           </w:tcPr>
           <w:p>
             <w:pPr>
@@ -178,7 +178,7 @@
         </w:tc>
         <w:tc>
           <w:tcPr>
-            <w:tcW w:w="3120" w:type="dxa"/>
+            <w:tcW w:w="2880" w:type="dxa"/>
           </w:tcPr>
           <w:p>
             <w:pPr>
@@ -199,7 +199,7 @@
         </w:tc>
         <w:tc>
           <w:tcPr>
-            <w:tcW w:w="3120" w:type="dxa"/>
+            <w:tcW w:w="2880" w:type="dxa"/>
           </w:tcPr>
           <w:p>
             <w:pPr>
@@ -249,8 +249,8 @@
         <w:tblLook w:val="0000" w:firstRow="0" w:lastRow="0" w:firstColumn="0" w:lastColumn="0" w:noHBand="1" w:noVBand="1"/>
       </w:tblPr>
       <w:tblGrid>
-        <w:gridCol w:w="2240"/>
-        <w:gridCol w:w="7120"/>
+        <w:gridCol w:w="2068"/>
+        <w:gridCol w:w="6572"/>
       </w:tblGrid>
       <w:tr>
         <w:trPr>
@@ -258,7 +258,7 @@
         </w:trPr>
         <w:tc>
           <w:tcPr>
-            <w:tcW w:w="2240" w:type="dxa"/>
+            <w:tcW w:w="2068" w:type="dxa"/>
           </w:tcPr>
           <w:p>
             <w:pPr>
@@ -271,7 +271,7 @@
         </w:tc>
         <w:tc>
           <w:tcPr>
-            <w:tcW w:w="7120" w:type="dxa"/>
+            <w:tcW w:w="6572" w:type="dxa"/>
             <w:tcMar>
               <w:right w:w="0" w:type="dxa"/>
             </w:tcMar>
@@ -350,7 +350,7 @@
       <w:footerReference w:type="default" r:id="rIdF1"/>
       <w:footerReference w:type="first" r:id="rIdF2"/>
       <w:pgSz w:w="12240" w:h="15840"/>
-      <w:pgMar w:top="1080" w:right="1440" w:bottom="880" w:left="1440" w:header="560" w:footer="360" w:gutter="0"/>
+      <w:pgMar w:top="1840" w:right="1800" w:bottom="1400" w:left="1800" w:header="720" w:footer="560" w:gutter="0"/>
       <w:cols w:space="720"/>
       <w:titlePg/>
     </w:sectPr>
@@ -482,8 +482,8 @@
       <w:rPr>
         <w:rFonts w:ascii="Source Serif 4" w:hAnsi="Source Serif 4" w:cs="Source Serif 4" w:eastAsia="Source Serif 4"/>
         <w:color w:val="15140F"/>
-        <w:sz w:val="23"/>
-        <w:szCs w:val="23"/>
+        <w:sz w:val="21"/>
+        <w:szCs w:val="21"/>
         <w:lang w:val="en-GB"/>
       </w:rPr>
     </w:rPrDefault>
@@ -498,7 +498,7 @@
     <w:uiPriority w:val="1"/>
     <w:qFormat/>
     <w:pPr>
-      <w:spacing w:before="0" w:after="220" w:line="370" w:lineRule="exact"/>
+      <w:spacing w:before="0" w:after="160" w:line="320" w:lineRule="exact"/>
     </w:pPr>
   </w:style>
   <w:style w:type="paragraph" w:customStyle="1" w:styleId="Body">
@@ -508,8 +508,7 @@
     <w:uiPriority w:val="1"/>
     <w:qFormat/>
     <w:pPr>
-      <w:spacing w:before="0" w:after="220" w:line="370" w:lineRule="exact"/>
-      <w:ind w:right="960"/>
+      <w:spacing w:before="0" w:after="160" w:line="320" w:lineRule="exact"/>
     </w:pPr>
   </w:style>
   <w:style w:type="paragraph" w:styleId="Title">
@@ -520,14 +519,13 @@
     <w:qFormat/>
     <w:pPr>
       <w:keepNext/>
-      <w:spacing w:before="0" w:after="480" w:line="800" w:lineRule="exact"/>
-      <w:ind w:right="960"/>
+      <w:spacing w:before="0" w:after="480" w:line="700" w:lineRule="exact"/>
     </w:pPr>
     <w:rPr>
       <w:rFonts w:ascii="Source Serif 4 Display" w:hAnsi="Source Serif 4 Display" w:cs="Source Serif 4 Display" w:eastAsia="Source Serif 4 Display"/>
       <w:spacing w:val="-4"/>
-      <w:sz w:val="72"/>
-      <w:szCs w:val="72"/>
+      <w:sz w:val="64"/>
+      <w:szCs w:val="64"/>
     </w:rPr>
   </w:style>
   <w:style w:type="paragraph" w:customStyle="1" w:styleId="Eyebrow">
@@ -544,8 +542,8 @@
       <w:smallCaps/>
       <w:color w:val="9C4221"/>
       <w:spacing w:val="10"/>
-      <w:sz w:val="21"/>
-      <w:szCs w:val="21"/>
+      <w:sz w:val="17"/>
+      <w:szCs w:val="17"/>
     </w:rPr>
   </w:style>
   <w:style w:type="paragraph" w:customStyle="1" w:styleId="Lead">
@@ -555,13 +553,12 @@
     <w:uiPriority w:val="1"/>
     <w:qFormat/>
     <w:pPr>
-      <w:spacing w:before="0" w:after="220" w:line="380" w:lineRule="exact"/>
-      <w:ind w:right="960"/>
+      <w:spacing w:before="0" w:after="220" w:line="340" w:lineRule="exact"/>
     </w:pPr>
     <w:rPr>
       <w:color w:val="4A4740"/>
-      <w:sz w:val="25"/>
-      <w:szCs w:val="25"/>
+      <w:sz w:val="23"/>
+      <w:szCs w:val="23"/>
     </w:rPr>
   </w:style>
   <w:style w:type="paragraph" w:styleId="Heading1">
@@ -573,13 +570,13 @@
     <w:pPr>
       <w:keepNext/>
       <w:keepLines/>
-      <w:spacing w:before="560" w:after="200" w:line="480" w:lineRule="exact"/>
+      <w:spacing w:before="640" w:after="160" w:line="420" w:lineRule="exact"/>
       <w:outlineLvl w:val="0"/>
     </w:pPr>
     <w:rPr>
       <w:rFonts w:ascii="Source Serif 4 Subhead" w:hAnsi="Source Serif 4 Subhead" w:cs="Source Serif 4 Subhead" w:eastAsia="Source Serif 4 Subhead"/>
-      <w:sz w:val="40"/>
-      <w:szCs w:val="40"/>
+      <w:sz w:val="34"/>
+      <w:szCs w:val="34"/>
     </w:rPr>
   </w:style>
   <w:style w:type="paragraph" w:styleId="Heading2">
@@ -591,13 +588,13 @@
     <w:pPr>
       <w:keepNext/>
       <w:keepLines/>
-      <w:spacing w:before="360" w:after="120" w:line="380" w:lineRule="exact"/>
+      <w:spacing w:before="360" w:after="120" w:line="340" w:lineRule="exact"/>
       <w:outlineLvl w:val="1"/>
     </w:pPr>
     <w:rPr>
       <w:rFonts w:ascii="Source Serif 4 Subhead" w:hAnsi="Source Serif 4 Subhead" w:cs="Source Serif 4 Subhead" w:eastAsia="Source Serif 4 Subhead"/>
-      <w:sz w:val="28"/>
-      <w:szCs w:val="28"/>
+      <w:sz w:val="26"/>
+      <w:szCs w:val="26"/>
     </w:rPr>
   </w:style>
   <w:style w:type="paragraph" w:styleId="Heading3">
@@ -608,7 +605,7 @@
     <w:qFormat/>
     <w:pPr>
       <w:keepNext/>
-      <w:spacing w:before="240" w:after="40" w:line="370" w:lineRule="exact"/>
+      <w:spacing w:before="240" w:after="40" w:line="320" w:lineRule="exact"/>
       <w:outlineLvl w:val="2"/>
     </w:pPr>
     <w:rPr>
@@ -630,8 +627,8 @@
       <w:smallCaps/>
       <w:color w:val="77716A"/>
       <w:spacing w:val="10"/>
-      <w:sz w:val="21"/>
-      <w:szCs w:val="21"/>
+      <w:sz w:val="17"/>
+      <w:szCs w:val="17"/>
     </w:rPr>
   </w:style>
   <w:style w:type="paragraph" w:customStyle="1" w:styleId="Figure">
@@ -669,25 +666,25 @@
       <w:i/>
       <w:iCs/>
       <w:color w:val="9C4221"/>
+      <w:sz w:val="17"/>
+      <w:szCs w:val="17"/>
+    </w:rPr>
+  </w:style>
+  <w:style w:type="paragraph" w:styleId="Caption">
+    <w:name w:val="caption"/>
+    <w:basedOn w:val="Normal"/>
+    <w:next w:val="Body"/>
+    <w:uiPriority w:val="1"/>
+    <w:qFormat/>
+    <w:pPr>
+      <w:spacing w:before="140" w:after="280" w:line="260" w:lineRule="exact"/>
+    </w:pPr>
+    <w:rPr>
+      <w:color w:val="4A4740"/>
       <w:sz w:val="18"/>
       <w:szCs w:val="18"/>
     </w:rPr>
   </w:style>
-  <w:style w:type="paragraph" w:styleId="Caption">
-    <w:name w:val="caption"/>
-    <w:basedOn w:val="Normal"/>
-    <w:next w:val="Body"/>
-    <w:uiPriority w:val="1"/>
-    <w:qFormat/>
-    <w:pPr>
-      <w:spacing w:before="140" w:after="280" w:line="300" w:lineRule="exact"/>
-    </w:pPr>
-    <w:rPr>
-      <w:color w:val="4A4740"/>
-      <w:sz w:val="20"/>
-      <w:szCs w:val="20"/>
-    </w:rPr>
-  </w:style>
   <w:style w:type="paragraph" w:customStyle="1" w:styleId="StatFigure">
     <w:name w:val="Stat Figure"/>
     <w:basedOn w:val="Normal"/>
@@ -696,12 +693,12 @@
     <w:qFormat/>
     <w:pPr>
       <w:keepNext/>
-      <w:spacing w:before="0" w:after="140" w:line="560" w:lineRule="exact"/>
+      <w:spacing w:before="0" w:after="140" w:line="480" w:lineRule="exact"/>
     </w:pPr>
     <w:rPr>
       <w:rFonts w:ascii="Source Serif 4 Display" w:hAnsi="Source Serif 4 Display" w:cs="Source Serif 4 Display" w:eastAsia="Source Serif 4 Display"/>
-      <w:sz w:val="56"/>
-      <w:szCs w:val="56"/>
+      <w:sz w:val="48"/>
+      <w:szCs w:val="48"/>
     </w:rPr>
   </w:style>
   <w:style w:type="paragraph" w:customStyle="1" w:styleId="StatCaption">
@@ -711,12 +708,12 @@
     <w:uiPriority w:val="1"/>
     <w:qFormat/>
     <w:pPr>
-      <w:spacing w:before="0" w:after="0" w:line="280" w:lineRule="exact"/>
+      <w:spacing w:before="0" w:after="0" w:line="240" w:lineRule="exact"/>
     </w:pPr>
     <w:rPr>
       <w:color w:val="4A4740"/>
-      <w:sz w:val="19"/>
-      <w:szCs w:val="19"/>
+      <w:sz w:val="17"/>
+      <w:szCs w:val="17"/>
     </w:rPr>
   </w:style>
   <w:style w:type="paragraph" w:customStyle="1" w:styleId="CalloutLabel">
@@ -726,14 +723,14 @@
     <w:qFormat/>
     <w:pPr>
       <w:keepNext/>
-      <w:spacing w:before="0" w:after="0" w:line="320" w:lineRule="exact"/>
+      <w:spacing w:before="0" w:after="0" w:line="300" w:lineRule="exact"/>
     </w:pPr>
     <w:rPr>
       <w:smallCaps/>
       <w:color w:val="9C4221"/>
       <w:spacing w:val="10"/>
-      <w:sz w:val="21"/>
-      <w:szCs w:val="21"/>
+      <w:sz w:val="17"/>
+      <w:szCs w:val="17"/>
     </w:rPr>
   </w:style>
   <w:style w:type="paragraph" w:customStyle="1" w:styleId="Callout">
@@ -742,11 +739,11 @@
     <w:uiPriority w:val="1"/>
     <w:qFormat/>
     <w:pPr>
-      <w:spacing w:before="0" w:after="0" w:line="320" w:lineRule="exact"/>
-    </w:pPr>
-    <w:rPr>
-      <w:sz w:val="21"/>
-      <w:szCs w:val="21"/>
+      <w:spacing w:before="0" w:after="0" w:line="300" w:lineRule="exact"/>
+    </w:pPr>
+    <w:rPr>
+      <w:sz w:val="20"/>
+      <w:szCs w:val="20"/>
     </w:rPr>
   </w:style>
   <w:style w:type="paragraph" w:customStyle="1" w:styleId="Claim">
@@ -760,13 +757,12 @@
       <w:pBdr>
         <w:top w:val="single" w:sz="6" w:space="16" w:color="15140F"/>
       </w:pBdr>
-      <w:spacing w:before="440" w:after="240" w:line="500" w:lineRule="exact"/>
-      <w:ind w:right="960"/>
+      <w:spacing w:before="440" w:after="240" w:line="460" w:lineRule="exact"/>
     </w:pPr>
     <w:rPr>
       <w:rFonts w:ascii="Source Serif 4 Subhead" w:hAnsi="Source Serif 4 Subhead" w:cs="Source Serif 4 Subhead" w:eastAsia="Source Serif 4 Subhead"/>
-      <w:sz w:val="38"/>
-      <w:szCs w:val="38"/>
+      <w:sz w:val="34"/>
+      <w:szCs w:val="34"/>
     </w:rPr>
   </w:style>
   <w:style w:type="paragraph" w:customStyle="1" w:styleId="ClaimAttribution">
@@ -785,8 +781,8 @@
       <w:smallCaps/>
       <w:color w:val="77716A"/>
       <w:spacing w:val="10"/>
-      <w:sz w:val="21"/>
-      <w:szCs w:val="21"/>
+      <w:sz w:val="17"/>
+      <w:szCs w:val="17"/>
     </w:rPr>
   </w:style>
   <w:style w:type="paragraph" w:customStyle="1" w:styleId="Code">
@@ -821,8 +817,8 @@
     <w:qFormat/>
     <w:pPr>
       <w:tabs>
-        <w:tab w:val="center" w:pos="4680"/>
-        <w:tab w:val="right" w:pos="9360"/>
+        <w:tab w:val="center" w:pos="4320"/>
+        <w:tab w:val="right" w:pos="8640"/>
       </w:tabs>
       <w:spacing w:before="240" w:after="240" w:line="400" w:lineRule="auto"/>
     </w:pPr>
@@ -842,8 +838,8 @@
         <w:ilvl w:val="0"/>
         <w:numId w:val="1"/>
       </w:numPr>
-      <w:spacing w:before="0" w:after="60" w:line="370" w:lineRule="exact"/>
-      <w:ind w:left="360" w:right="960" w:hanging="360"/>
+      <w:spacing w:before="0" w:after="60" w:line="320" w:lineRule="exact"/>
+      <w:ind w:left="360" w:hanging="360"/>
     </w:pPr>
   </w:style>
   <w:style w:type="paragraph" w:customStyle="1" w:styleId="SourcesList">
@@ -857,12 +853,12 @@
         <w:ilvl w:val="0"/>
         <w:numId w:val="2"/>
       </w:numPr>
-      <w:spacing w:before="0" w:after="180" w:line="320" w:lineRule="exact"/>
+      <w:spacing w:before="0" w:after="180" w:line="280" w:lineRule="exact"/>
       <w:ind w:left="520" w:hanging="520"/>
     </w:pPr>
     <w:rPr>
-      <w:sz w:val="21"/>
-      <w:szCs w:val="21"/>
+      <w:sz w:val="19"/>
+      <w:szCs w:val="19"/>
     </w:rPr>
   </w:style>
   <w:style w:type="paragraph" w:customStyle="1" w:styleId="Provenance">
@@ -875,12 +871,12 @@
       <w:pBdr>
         <w:top w:val="single" w:sz="6" w:space="6" w:color="DED8CA"/>
       </w:pBdr>
-      <w:spacing w:before="400" w:after="0" w:line="240" w:lineRule="exact"/>
+      <w:spacing w:before="400" w:after="0" w:line="220" w:lineRule="exact"/>
     </w:pPr>
     <w:rPr>
       <w:color w:val="77716A"/>
-      <w:sz w:val="17"/>
-      <w:szCs w:val="17"/>
+      <w:sz w:val="15"/>
+      <w:szCs w:val="15"/>
     </w:rPr>
   </w:style>
   <w:style w:type="paragraph" w:customStyle="1" w:styleId="TableHead">
@@ -896,8 +892,8 @@
       <w:smallCaps/>
       <w:color w:val="77716A"/>
       <w:spacing w:val="10"/>
-      <w:sz w:val="21"/>
-      <w:szCs w:val="21"/>
+      <w:sz w:val="17"/>
+      <w:szCs w:val="17"/>
     </w:rPr>
   </w:style>
   <w:style w:type="paragraph" w:customStyle="1" w:styleId="TableBody">
@@ -909,8 +905,8 @@
       <w:spacing w:before="0" w:after="0" w:line="320" w:lineRule="exact"/>
     </w:pPr>
     <w:rPr>
-      <w:sz w:val="22"/>
-      <w:szCs w:val="22"/>
+      <w:sz w:val="20"/>
+      <w:szCs w:val="20"/>
     </w:rPr>
   </w:style>
   <w:style w:type="paragraph" w:customStyle="1" w:styleId="PlateSpec">
@@ -927,8 +923,8 @@
       <w:smallCaps/>
       <w:color w:val="15140F"/>
       <w:spacing w:val="10"/>
-      <w:sz w:val="21"/>
-      <w:szCs w:val="21"/>
+      <w:sz w:val="17"/>
+      <w:szCs w:val="17"/>
     </w:rPr>
   </w:style>
   <w:style w:type="paragraph" w:customStyle="1" w:styleId="PlateCaption">
@@ -939,11 +935,10 @@
     <w:qFormat/>
     <w:pPr>
       <w:spacing w:before="0" w:after="280" w:line="320" w:lineRule="exact"/>
-      <w:ind w:right="960"/>
-    </w:pPr>
-    <w:rPr>
-      <w:sz w:val="21"/>
-      <w:szCs w:val="21"/>
+    </w:pPr>
+    <w:rPr>
+      <w:sz w:val="19"/>
+      <w:szCs w:val="19"/>
     </w:rPr>
   </w:style>
   <w:style w:type="paragraph" w:styleId="Header">
@@ -958,16 +953,16 @@
         <w:bottom w:val="single" w:sz="6" w:space="5" w:color="DED8CA"/>
       </w:pBdr>
       <w:tabs>
-        <w:tab w:val="right" w:pos="9360"/>
+        <w:tab w:val="right" w:pos="8640"/>
       </w:tabs>
       <w:spacing w:before="0" w:after="0" w:line="280" w:lineRule="exact"/>
     </w:pPr>
     <w:rPr>
       <w:smallCaps/>
       <w:color w:val="77716A"/>
-      <w:spacing w:val="10"/>
-      <w:sz w:val="21"/>
-      <w:szCs w:val="21"/>
+      <w:spacing w:val="14"/>
+      <w:sz w:val="16"/>
+      <w:szCs w:val="16"/>
     </w:rPr>
   </w:style>
   <w:style w:type="paragraph" w:styleId="Footer">
@@ -979,16 +974,16 @@
     <w:qFormat/>
     <w:pPr>
       <w:tabs>
-        <w:tab w:val="right" w:pos="9360"/>
+        <w:tab w:val="right" w:pos="8640"/>
       </w:tabs>
       <w:spacing w:before="0" w:after="0" w:line="280" w:lineRule="exact"/>
     </w:pPr>
     <w:rPr>
       <w:smallCaps/>
       <w:color w:val="77716A"/>
-      <w:spacing w:val="10"/>
-      <w:sz w:val="21"/>
-      <w:szCs w:val="21"/>
+      <w:spacing w:val="14"/>
+      <w:sz w:val="16"/>
+      <w:szCs w:val="16"/>
     </w:rPr>
   </w:style>
   <w:style w:type="paragraph" w:styleId="TOC1">
@@ -1001,7 +996,7 @@
     <w:qFormat/>
     <w:pPr>
       <w:tabs>
-        <w:tab w:val="right" w:pos="9360"/>
+        <w:tab w:val="right" w:pos="8640"/>
       </w:tabs>
       <w:spacing w:before="240" w:after="40" w:line="370" w:lineRule="exact"/>
     </w:pPr>
@@ -1016,7 +1011,7 @@
     <w:qFormat/>
     <w:pPr>
       <w:tabs>
-        <w:tab w:val="right" w:pos="9360"/>
+        <w:tab w:val="right" w:pos="8640"/>
       </w:tabs>
       <w:spacing w:before="0" w:after="20" w:line="300" w:lineRule="exact"/>
       <w:ind w:left="320"/>
@@ -1044,6 +1039,8 @@
       <w:smallCaps w:val="0"/>
       <w:color w:val="4A4740"/>
       <w:spacing w:val="0"/>
+      <w:sz w:val="19"/>
+      <w:szCs w:val="19"/>
     </w:rPr>
   </w:style>
   <w:style w:type="character" w:customStyle="1" w:styleId="LabelMuted">
@@ -1070,8 +1067,8 @@
       <w:smallCaps/>
       <w:color w:val="77716A"/>
       <w:spacing w:val="10"/>
-      <w:sz w:val="21"/>
-      <w:szCs w:val="21"/>
+      <w:sz w:val="17"/>
+      <w:szCs w:val="17"/>
     </w:rPr>
   </w:style>
   <w:style w:type="character" w:customStyle="1" w:styleId="URL">
@@ -1224,11 +1221,11 @@
     <w:uiPriority w:val="1"/>
     <w:qFormat/>
     <w:pPr>
-      <w:spacing w:before="0" w:after="400" w:line="960" w:lineRule="exact"/>
-    </w:pPr>
-    <w:rPr>
-      <w:sz w:val="88"/>
-      <w:szCs w:val="88"/>
+      <w:spacing w:before="0" w:after="400" w:line="880" w:lineRule="exact"/>
+    </w:pPr>
+    <w:rPr>
+      <w:sz w:val="80"/>
+      <w:szCs w:val="80"/>
     </w:rPr>
   </w:style>
   <w:style w:type="paragraph" w:customStyle="1" w:styleId="TitlePageHeader">
@@ -1253,5 +1250,15 @@
       </w:pBdr>
     </w:pPr>
   </w:style>
+  <w:style w:type="paragraph" w:customStyle="1" w:styleId="BodyJustified">
+    <w:name w:val="Body Justified"/>
+    <w:basedOn w:val="Body"/>
+    <w:next w:val="BodyJustified"/>
+    <w:uiPriority w:val="1"/>
+    <w:qFormat/>
+    <w:pPr>
+      <w:jc w:val="both"/>
+    </w:pPr>
+  </w:style>
 </w:styles>
 </file>
</xml_diff>

<commit_message>
Adopt house style v5.1 and bundle diagram-maker for figures (#8)
Claude-Session: https://claude.ai/code/session_01UiHLU5PSfYtvbU9aNiYacs

Co-authored-by: Claude Opus 5.5 (1M context) <noreply@anthropic.com>
</commit_message>
<xml_diff>
--- a/assets/word-template/house-style-short.docx
+++ b/assets/word-template/house-style-short.docx
@@ -67,7 +67,7 @@
       <w:r>
         <w:drawing>
           <wp:inline distT="0" distB="0" distL="0" distR="0">
-            <wp:extent cx="5715000" cy="1114425"/>
+            <wp:extent cx="5486400" cy="1069848"/>
             <wp:docPr id="1" name="Figure 1"/>
             <wp:cNvGraphicFramePr>
               <a:graphicFrameLocks noChangeAspect="1"/>
@@ -88,7 +88,7 @@
                   <pic:spPr>
                     <a:xfrm>
                       <a:off x="0" y="0"/>
-                      <a:ext cx="5715000" cy="1114425"/>
+                      <a:ext cx="5486400" cy="1069848"/>
                     </a:xfrm>
                     <a:prstGeom prst="rect">
                       <a:avLst/>
@@ -150,14 +150,14 @@
         <w:tblLook w:val="0420" w:firstRow="0" w:lastRow="0" w:firstColumn="0" w:lastColumn="0" w:noHBand="1" w:noVBand="1"/>
       </w:tblPr>
       <w:tblGrid>
-        <w:gridCol w:w="3120"/>
-        <w:gridCol w:w="3120"/>
-        <w:gridCol w:w="3120"/>
+        <w:gridCol w:w="2880"/>
+        <w:gridCol w:w="2880"/>
+        <w:gridCol w:w="2880"/>
       </w:tblGrid>
       <w:tr>
         <w:tc>
           <w:tcPr>
-            <w:tcW w:w="3120" w:type="dxa"/>
+            <w:tcW w:w="2880" w:type="dxa"/>
           </w:tcPr>
           <w:p>
             <w:pPr>
@@ -178,7 +178,7 @@
         </w:tc>
         <w:tc>
           <w:tcPr>
-            <w:tcW w:w="3120" w:type="dxa"/>
+            <w:tcW w:w="2880" w:type="dxa"/>
           </w:tcPr>
           <w:p>
             <w:pPr>
@@ -199,7 +199,7 @@
         </w:tc>
         <w:tc>
           <w:tcPr>
-            <w:tcW w:w="3120" w:type="dxa"/>
+            <w:tcW w:w="2880" w:type="dxa"/>
           </w:tcPr>
           <w:p>
             <w:pPr>
@@ -249,8 +249,8 @@
         <w:tblLook w:val="0000" w:firstRow="0" w:lastRow="0" w:firstColumn="0" w:lastColumn="0" w:noHBand="1" w:noVBand="1"/>
       </w:tblPr>
       <w:tblGrid>
-        <w:gridCol w:w="2240"/>
-        <w:gridCol w:w="7120"/>
+        <w:gridCol w:w="2068"/>
+        <w:gridCol w:w="6572"/>
       </w:tblGrid>
       <w:tr>
         <w:trPr>
@@ -258,7 +258,7 @@
         </w:trPr>
         <w:tc>
           <w:tcPr>
-            <w:tcW w:w="2240" w:type="dxa"/>
+            <w:tcW w:w="2068" w:type="dxa"/>
           </w:tcPr>
           <w:p>
             <w:pPr>
@@ -271,7 +271,7 @@
         </w:tc>
         <w:tc>
           <w:tcPr>
-            <w:tcW w:w="7120" w:type="dxa"/>
+            <w:tcW w:w="6572" w:type="dxa"/>
             <w:tcMar>
               <w:right w:w="0" w:type="dxa"/>
             </w:tcMar>
@@ -350,7 +350,7 @@
       <w:footerReference w:type="default" r:id="rIdF1"/>
       <w:footerReference w:type="first" r:id="rIdF2"/>
       <w:pgSz w:w="12240" w:h="15840"/>
-      <w:pgMar w:top="1080" w:right="1440" w:bottom="880" w:left="1440" w:header="560" w:footer="360" w:gutter="0"/>
+      <w:pgMar w:top="1840" w:right="1800" w:bottom="1400" w:left="1800" w:header="720" w:footer="560" w:gutter="0"/>
       <w:cols w:space="720"/>
       <w:titlePg/>
     </w:sectPr>
@@ -482,8 +482,8 @@
       <w:rPr>
         <w:rFonts w:ascii="Source Serif 4" w:hAnsi="Source Serif 4" w:cs="Source Serif 4" w:eastAsia="Source Serif 4"/>
         <w:color w:val="15140F"/>
-        <w:sz w:val="23"/>
-        <w:szCs w:val="23"/>
+        <w:sz w:val="21"/>
+        <w:szCs w:val="21"/>
         <w:lang w:val="en-GB"/>
       </w:rPr>
     </w:rPrDefault>
@@ -498,7 +498,7 @@
     <w:uiPriority w:val="1"/>
     <w:qFormat/>
     <w:pPr>
-      <w:spacing w:before="0" w:after="220" w:line="370" w:lineRule="exact"/>
+      <w:spacing w:before="0" w:after="160" w:line="320" w:lineRule="exact"/>
     </w:pPr>
   </w:style>
   <w:style w:type="paragraph" w:customStyle="1" w:styleId="Body">
@@ -508,8 +508,7 @@
     <w:uiPriority w:val="1"/>
     <w:qFormat/>
     <w:pPr>
-      <w:spacing w:before="0" w:after="220" w:line="370" w:lineRule="exact"/>
-      <w:ind w:right="960"/>
+      <w:spacing w:before="0" w:after="160" w:line="320" w:lineRule="exact"/>
     </w:pPr>
   </w:style>
   <w:style w:type="paragraph" w:styleId="Title">
@@ -520,14 +519,13 @@
     <w:qFormat/>
     <w:pPr>
       <w:keepNext/>
-      <w:spacing w:before="0" w:after="480" w:line="800" w:lineRule="exact"/>
-      <w:ind w:right="960"/>
+      <w:spacing w:before="0" w:after="480" w:line="700" w:lineRule="exact"/>
     </w:pPr>
     <w:rPr>
       <w:rFonts w:ascii="Source Serif 4 Display" w:hAnsi="Source Serif 4 Display" w:cs="Source Serif 4 Display" w:eastAsia="Source Serif 4 Display"/>
       <w:spacing w:val="-4"/>
-      <w:sz w:val="72"/>
-      <w:szCs w:val="72"/>
+      <w:sz w:val="64"/>
+      <w:szCs w:val="64"/>
     </w:rPr>
   </w:style>
   <w:style w:type="paragraph" w:customStyle="1" w:styleId="Eyebrow">
@@ -544,8 +542,8 @@
       <w:smallCaps/>
       <w:color w:val="9C4221"/>
       <w:spacing w:val="10"/>
-      <w:sz w:val="21"/>
-      <w:szCs w:val="21"/>
+      <w:sz w:val="17"/>
+      <w:szCs w:val="17"/>
     </w:rPr>
   </w:style>
   <w:style w:type="paragraph" w:customStyle="1" w:styleId="Lead">
@@ -555,13 +553,12 @@
     <w:uiPriority w:val="1"/>
     <w:qFormat/>
     <w:pPr>
-      <w:spacing w:before="0" w:after="220" w:line="380" w:lineRule="exact"/>
-      <w:ind w:right="960"/>
+      <w:spacing w:before="0" w:after="220" w:line="340" w:lineRule="exact"/>
     </w:pPr>
     <w:rPr>
       <w:color w:val="4A4740"/>
-      <w:sz w:val="25"/>
-      <w:szCs w:val="25"/>
+      <w:sz w:val="23"/>
+      <w:szCs w:val="23"/>
     </w:rPr>
   </w:style>
   <w:style w:type="paragraph" w:styleId="Heading1">
@@ -573,13 +570,13 @@
     <w:pPr>
       <w:keepNext/>
       <w:keepLines/>
-      <w:spacing w:before="560" w:after="200" w:line="480" w:lineRule="exact"/>
+      <w:spacing w:before="640" w:after="160" w:line="420" w:lineRule="exact"/>
       <w:outlineLvl w:val="0"/>
     </w:pPr>
     <w:rPr>
       <w:rFonts w:ascii="Source Serif 4 Subhead" w:hAnsi="Source Serif 4 Subhead" w:cs="Source Serif 4 Subhead" w:eastAsia="Source Serif 4 Subhead"/>
-      <w:sz w:val="40"/>
-      <w:szCs w:val="40"/>
+      <w:sz w:val="34"/>
+      <w:szCs w:val="34"/>
     </w:rPr>
   </w:style>
   <w:style w:type="paragraph" w:styleId="Heading2">
@@ -591,13 +588,13 @@
     <w:pPr>
       <w:keepNext/>
       <w:keepLines/>
-      <w:spacing w:before="360" w:after="120" w:line="380" w:lineRule="exact"/>
+      <w:spacing w:before="360" w:after="120" w:line="340" w:lineRule="exact"/>
       <w:outlineLvl w:val="1"/>
     </w:pPr>
     <w:rPr>
       <w:rFonts w:ascii="Source Serif 4 Subhead" w:hAnsi="Source Serif 4 Subhead" w:cs="Source Serif 4 Subhead" w:eastAsia="Source Serif 4 Subhead"/>
-      <w:sz w:val="28"/>
-      <w:szCs w:val="28"/>
+      <w:sz w:val="26"/>
+      <w:szCs w:val="26"/>
     </w:rPr>
   </w:style>
   <w:style w:type="paragraph" w:styleId="Heading3">
@@ -608,7 +605,7 @@
     <w:qFormat/>
     <w:pPr>
       <w:keepNext/>
-      <w:spacing w:before="240" w:after="40" w:line="370" w:lineRule="exact"/>
+      <w:spacing w:before="240" w:after="40" w:line="320" w:lineRule="exact"/>
       <w:outlineLvl w:val="2"/>
     </w:pPr>
     <w:rPr>
@@ -630,8 +627,8 @@
       <w:smallCaps/>
       <w:color w:val="77716A"/>
       <w:spacing w:val="10"/>
-      <w:sz w:val="21"/>
-      <w:szCs w:val="21"/>
+      <w:sz w:val="17"/>
+      <w:szCs w:val="17"/>
     </w:rPr>
   </w:style>
   <w:style w:type="paragraph" w:customStyle="1" w:styleId="Figure">
@@ -669,25 +666,25 @@
       <w:i/>
       <w:iCs/>
       <w:color w:val="9C4221"/>
+      <w:sz w:val="17"/>
+      <w:szCs w:val="17"/>
+    </w:rPr>
+  </w:style>
+  <w:style w:type="paragraph" w:styleId="Caption">
+    <w:name w:val="caption"/>
+    <w:basedOn w:val="Normal"/>
+    <w:next w:val="Body"/>
+    <w:uiPriority w:val="1"/>
+    <w:qFormat/>
+    <w:pPr>
+      <w:spacing w:before="140" w:after="280" w:line="260" w:lineRule="exact"/>
+    </w:pPr>
+    <w:rPr>
+      <w:color w:val="4A4740"/>
       <w:sz w:val="18"/>
       <w:szCs w:val="18"/>
     </w:rPr>
   </w:style>
-  <w:style w:type="paragraph" w:styleId="Caption">
-    <w:name w:val="caption"/>
-    <w:basedOn w:val="Normal"/>
-    <w:next w:val="Body"/>
-    <w:uiPriority w:val="1"/>
-    <w:qFormat/>
-    <w:pPr>
-      <w:spacing w:before="140" w:after="280" w:line="300" w:lineRule="exact"/>
-    </w:pPr>
-    <w:rPr>
-      <w:color w:val="4A4740"/>
-      <w:sz w:val="20"/>
-      <w:szCs w:val="20"/>
-    </w:rPr>
-  </w:style>
   <w:style w:type="paragraph" w:customStyle="1" w:styleId="StatFigure">
     <w:name w:val="Stat Figure"/>
     <w:basedOn w:val="Normal"/>
@@ -696,12 +693,12 @@
     <w:qFormat/>
     <w:pPr>
       <w:keepNext/>
-      <w:spacing w:before="0" w:after="140" w:line="560" w:lineRule="exact"/>
+      <w:spacing w:before="0" w:after="140" w:line="480" w:lineRule="exact"/>
     </w:pPr>
     <w:rPr>
       <w:rFonts w:ascii="Source Serif 4 Display" w:hAnsi="Source Serif 4 Display" w:cs="Source Serif 4 Display" w:eastAsia="Source Serif 4 Display"/>
-      <w:sz w:val="56"/>
-      <w:szCs w:val="56"/>
+      <w:sz w:val="48"/>
+      <w:szCs w:val="48"/>
     </w:rPr>
   </w:style>
   <w:style w:type="paragraph" w:customStyle="1" w:styleId="StatCaption">
@@ -711,12 +708,12 @@
     <w:uiPriority w:val="1"/>
     <w:qFormat/>
     <w:pPr>
-      <w:spacing w:before="0" w:after="0" w:line="280" w:lineRule="exact"/>
+      <w:spacing w:before="0" w:after="0" w:line="240" w:lineRule="exact"/>
     </w:pPr>
     <w:rPr>
       <w:color w:val="4A4740"/>
-      <w:sz w:val="19"/>
-      <w:szCs w:val="19"/>
+      <w:sz w:val="17"/>
+      <w:szCs w:val="17"/>
     </w:rPr>
   </w:style>
   <w:style w:type="paragraph" w:customStyle="1" w:styleId="CalloutLabel">
@@ -726,14 +723,14 @@
     <w:qFormat/>
     <w:pPr>
       <w:keepNext/>
-      <w:spacing w:before="0" w:after="0" w:line="320" w:lineRule="exact"/>
+      <w:spacing w:before="0" w:after="0" w:line="300" w:lineRule="exact"/>
     </w:pPr>
     <w:rPr>
       <w:smallCaps/>
       <w:color w:val="9C4221"/>
       <w:spacing w:val="10"/>
-      <w:sz w:val="21"/>
-      <w:szCs w:val="21"/>
+      <w:sz w:val="17"/>
+      <w:szCs w:val="17"/>
     </w:rPr>
   </w:style>
   <w:style w:type="paragraph" w:customStyle="1" w:styleId="Callout">
@@ -742,11 +739,11 @@
     <w:uiPriority w:val="1"/>
     <w:qFormat/>
     <w:pPr>
-      <w:spacing w:before="0" w:after="0" w:line="320" w:lineRule="exact"/>
-    </w:pPr>
-    <w:rPr>
-      <w:sz w:val="21"/>
-      <w:szCs w:val="21"/>
+      <w:spacing w:before="0" w:after="0" w:line="300" w:lineRule="exact"/>
+    </w:pPr>
+    <w:rPr>
+      <w:sz w:val="20"/>
+      <w:szCs w:val="20"/>
     </w:rPr>
   </w:style>
   <w:style w:type="paragraph" w:customStyle="1" w:styleId="Claim">
@@ -760,13 +757,12 @@
       <w:pBdr>
         <w:top w:val="single" w:sz="6" w:space="16" w:color="15140F"/>
       </w:pBdr>
-      <w:spacing w:before="440" w:after="240" w:line="500" w:lineRule="exact"/>
-      <w:ind w:right="960"/>
+      <w:spacing w:before="440" w:after="240" w:line="460" w:lineRule="exact"/>
     </w:pPr>
     <w:rPr>
       <w:rFonts w:ascii="Source Serif 4 Subhead" w:hAnsi="Source Serif 4 Subhead" w:cs="Source Serif 4 Subhead" w:eastAsia="Source Serif 4 Subhead"/>
-      <w:sz w:val="38"/>
-      <w:szCs w:val="38"/>
+      <w:sz w:val="34"/>
+      <w:szCs w:val="34"/>
     </w:rPr>
   </w:style>
   <w:style w:type="paragraph" w:customStyle="1" w:styleId="ClaimAttribution">
@@ -785,8 +781,8 @@
       <w:smallCaps/>
       <w:color w:val="77716A"/>
       <w:spacing w:val="10"/>
-      <w:sz w:val="21"/>
-      <w:szCs w:val="21"/>
+      <w:sz w:val="17"/>
+      <w:szCs w:val="17"/>
     </w:rPr>
   </w:style>
   <w:style w:type="paragraph" w:customStyle="1" w:styleId="Code">
@@ -821,8 +817,8 @@
     <w:qFormat/>
     <w:pPr>
       <w:tabs>
-        <w:tab w:val="center" w:pos="4680"/>
-        <w:tab w:val="right" w:pos="9360"/>
+        <w:tab w:val="center" w:pos="4320"/>
+        <w:tab w:val="right" w:pos="8640"/>
       </w:tabs>
       <w:spacing w:before="240" w:after="240" w:line="400" w:lineRule="auto"/>
     </w:pPr>
@@ -842,8 +838,8 @@
         <w:ilvl w:val="0"/>
         <w:numId w:val="1"/>
       </w:numPr>
-      <w:spacing w:before="0" w:after="60" w:line="370" w:lineRule="exact"/>
-      <w:ind w:left="360" w:right="960" w:hanging="360"/>
+      <w:spacing w:before="0" w:after="60" w:line="320" w:lineRule="exact"/>
+      <w:ind w:left="360" w:hanging="360"/>
     </w:pPr>
   </w:style>
   <w:style w:type="paragraph" w:customStyle="1" w:styleId="SourcesList">
@@ -857,12 +853,12 @@
         <w:ilvl w:val="0"/>
         <w:numId w:val="2"/>
       </w:numPr>
-      <w:spacing w:before="0" w:after="180" w:line="320" w:lineRule="exact"/>
+      <w:spacing w:before="0" w:after="180" w:line="280" w:lineRule="exact"/>
       <w:ind w:left="520" w:hanging="520"/>
     </w:pPr>
     <w:rPr>
-      <w:sz w:val="21"/>
-      <w:szCs w:val="21"/>
+      <w:sz w:val="19"/>
+      <w:szCs w:val="19"/>
     </w:rPr>
   </w:style>
   <w:style w:type="paragraph" w:customStyle="1" w:styleId="Provenance">
@@ -875,12 +871,12 @@
       <w:pBdr>
         <w:top w:val="single" w:sz="6" w:space="6" w:color="DED8CA"/>
       </w:pBdr>
-      <w:spacing w:before="400" w:after="0" w:line="240" w:lineRule="exact"/>
+      <w:spacing w:before="400" w:after="0" w:line="220" w:lineRule="exact"/>
     </w:pPr>
     <w:rPr>
       <w:color w:val="77716A"/>
-      <w:sz w:val="17"/>
-      <w:szCs w:val="17"/>
+      <w:sz w:val="15"/>
+      <w:szCs w:val="15"/>
     </w:rPr>
   </w:style>
   <w:style w:type="paragraph" w:customStyle="1" w:styleId="TableHead">
@@ -896,8 +892,8 @@
       <w:smallCaps/>
       <w:color w:val="77716A"/>
       <w:spacing w:val="10"/>
-      <w:sz w:val="21"/>
-      <w:szCs w:val="21"/>
+      <w:sz w:val="17"/>
+      <w:szCs w:val="17"/>
     </w:rPr>
   </w:style>
   <w:style w:type="paragraph" w:customStyle="1" w:styleId="TableBody">
@@ -909,8 +905,8 @@
       <w:spacing w:before="0" w:after="0" w:line="320" w:lineRule="exact"/>
     </w:pPr>
     <w:rPr>
-      <w:sz w:val="22"/>
-      <w:szCs w:val="22"/>
+      <w:sz w:val="20"/>
+      <w:szCs w:val="20"/>
     </w:rPr>
   </w:style>
   <w:style w:type="paragraph" w:customStyle="1" w:styleId="PlateSpec">
@@ -927,8 +923,8 @@
       <w:smallCaps/>
       <w:color w:val="15140F"/>
       <w:spacing w:val="10"/>
-      <w:sz w:val="21"/>
-      <w:szCs w:val="21"/>
+      <w:sz w:val="17"/>
+      <w:szCs w:val="17"/>
     </w:rPr>
   </w:style>
   <w:style w:type="paragraph" w:customStyle="1" w:styleId="PlateCaption">
@@ -939,11 +935,10 @@
     <w:qFormat/>
     <w:pPr>
       <w:spacing w:before="0" w:after="280" w:line="320" w:lineRule="exact"/>
-      <w:ind w:right="960"/>
-    </w:pPr>
-    <w:rPr>
-      <w:sz w:val="21"/>
-      <w:szCs w:val="21"/>
+    </w:pPr>
+    <w:rPr>
+      <w:sz w:val="19"/>
+      <w:szCs w:val="19"/>
     </w:rPr>
   </w:style>
   <w:style w:type="paragraph" w:styleId="Header">
@@ -958,16 +953,16 @@
         <w:bottom w:val="single" w:sz="6" w:space="5" w:color="DED8CA"/>
       </w:pBdr>
       <w:tabs>
-        <w:tab w:val="right" w:pos="9360"/>
+        <w:tab w:val="right" w:pos="8640"/>
       </w:tabs>
       <w:spacing w:before="0" w:after="0" w:line="280" w:lineRule="exact"/>
     </w:pPr>
     <w:rPr>
       <w:smallCaps/>
       <w:color w:val="77716A"/>
-      <w:spacing w:val="10"/>
-      <w:sz w:val="21"/>
-      <w:szCs w:val="21"/>
+      <w:spacing w:val="14"/>
+      <w:sz w:val="16"/>
+      <w:szCs w:val="16"/>
     </w:rPr>
   </w:style>
   <w:style w:type="paragraph" w:styleId="Footer">
@@ -979,16 +974,16 @@
     <w:qFormat/>
     <w:pPr>
       <w:tabs>
-        <w:tab w:val="right" w:pos="9360"/>
+        <w:tab w:val="right" w:pos="8640"/>
       </w:tabs>
       <w:spacing w:before="0" w:after="0" w:line="280" w:lineRule="exact"/>
     </w:pPr>
     <w:rPr>
       <w:smallCaps/>
       <w:color w:val="77716A"/>
-      <w:spacing w:val="10"/>
-      <w:sz w:val="21"/>
-      <w:szCs w:val="21"/>
+      <w:spacing w:val="14"/>
+      <w:sz w:val="16"/>
+      <w:szCs w:val="16"/>
     </w:rPr>
   </w:style>
   <w:style w:type="paragraph" w:styleId="TOC1">
@@ -1001,7 +996,7 @@
     <w:qFormat/>
     <w:pPr>
       <w:tabs>
-        <w:tab w:val="right" w:pos="9360"/>
+        <w:tab w:val="right" w:pos="8640"/>
       </w:tabs>
       <w:spacing w:before="240" w:after="40" w:line="370" w:lineRule="exact"/>
     </w:pPr>
@@ -1016,7 +1011,7 @@
     <w:qFormat/>
     <w:pPr>
       <w:tabs>
-        <w:tab w:val="right" w:pos="9360"/>
+        <w:tab w:val="right" w:pos="8640"/>
       </w:tabs>
       <w:spacing w:before="0" w:after="20" w:line="300" w:lineRule="exact"/>
       <w:ind w:left="320"/>
@@ -1044,6 +1039,8 @@
       <w:smallCaps w:val="0"/>
       <w:color w:val="4A4740"/>
       <w:spacing w:val="0"/>
+      <w:sz w:val="19"/>
+      <w:szCs w:val="19"/>
     </w:rPr>
   </w:style>
   <w:style w:type="character" w:customStyle="1" w:styleId="LabelMuted">
@@ -1070,8 +1067,8 @@
       <w:smallCaps/>
       <w:color w:val="77716A"/>
       <w:spacing w:val="10"/>
-      <w:sz w:val="21"/>
-      <w:szCs w:val="21"/>
+      <w:sz w:val="17"/>
+      <w:szCs w:val="17"/>
     </w:rPr>
   </w:style>
   <w:style w:type="character" w:customStyle="1" w:styleId="URL">
@@ -1224,11 +1221,11 @@
     <w:uiPriority w:val="1"/>
     <w:qFormat/>
     <w:pPr>
-      <w:spacing w:before="0" w:after="400" w:line="960" w:lineRule="exact"/>
-    </w:pPr>
-    <w:rPr>
-      <w:sz w:val="88"/>
-      <w:szCs w:val="88"/>
+      <w:spacing w:before="0" w:after="400" w:line="880" w:lineRule="exact"/>
+    </w:pPr>
+    <w:rPr>
+      <w:sz w:val="80"/>
+      <w:szCs w:val="80"/>
     </w:rPr>
   </w:style>
   <w:style w:type="paragraph" w:customStyle="1" w:styleId="TitlePageHeader">
@@ -1253,5 +1250,15 @@
       </w:pBdr>
     </w:pPr>
   </w:style>
+  <w:style w:type="paragraph" w:customStyle="1" w:styleId="BodyJustified">
+    <w:name w:val="Body Justified"/>
+    <w:basedOn w:val="Body"/>
+    <w:next w:val="BodyJustified"/>
+    <w:uiPriority w:val="1"/>
+    <w:qFormat/>
+    <w:pPr>
+      <w:jc w:val="both"/>
+    </w:pPr>
+  </w:style>
 </w:styles>
 </file>
</xml_diff>